<commit_message>
feat: complete methodology paper ready for submission
Manuscript for Systematic Reviews (Springer/BMC):
- Author: Hsieh-Ting Lin, Department of Oncology,
  Koo Foundation Sun Yat-Sen Cancer Center, Taipei, Taiwan
  ORCID: 0009-0002-3974-4528
- 6,417 words, 22 references (12/12 DOIs validated)
- 5 tables, 1 figure (pipeline architecture)
- Double-spaced, AMA citations
- Structured abstract (348/350 words)
- Declarations (ethics, funding, data availability, registration)
- Additional File 1: PRISMA 2020 checklist (3 case studies)
- Additional File 2: All prompt templates (7 types)
- PDF: 120 KB | DOCX: 38 KB

Validated on 3 hematology/oncology case studies:
  HLH (35/36) | DLBCL (35/36) | MM (33/36)

Co-Authored-By: Claude Opus 4.6 (1M context) <noreply@anthropic.com>
</commit_message>
<xml_diff>
--- a/manuscript/manuscript.docx
+++ b/manuscript/manuscript.docx
@@ -455,7 +455,255 @@
     </w:p>
     <w:p>
       <w:pPr>
-        <w:pStyle w:val="BodyText"/>
+        <w:pStyle w:val="SourceCode"/>
+      </w:pPr>
+      <w:r>
+        <w:rPr>
+          <w:rStyle w:val="VerbatimChar"/>
+        </w:rPr>
+        <w:t xml:space="preserve">Figure 1: Pipeline Architecture of Robust-Lit-Review</w:t>
+      </w:r>
+      <w:r>
+        <w:br/>
+      </w:r>
+      <w:r>
+        <w:br/>
+      </w:r>
+      <w:r>
+        <w:rPr>
+          <w:rStyle w:val="VerbatimChar"/>
+        </w:rPr>
+        <w:t xml:space="preserve">Topic Input</w:t>
+      </w:r>
+      <w:r>
+        <w:br/>
+      </w:r>
+      <w:r>
+        <w:rPr>
+          <w:rStyle w:val="VerbatimChar"/>
+        </w:rPr>
+        <w:t xml:space="preserve">    |</w:t>
+      </w:r>
+      <w:r>
+        <w:br/>
+      </w:r>
+      <w:r>
+        <w:rPr>
+          <w:rStyle w:val="VerbatimChar"/>
+        </w:rPr>
+        <w:t xml:space="preserve">    +---&gt; [Scopus API] --+</w:t>
+      </w:r>
+      <w:r>
+        <w:br/>
+      </w:r>
+      <w:r>
+        <w:rPr>
+          <w:rStyle w:val="VerbatimChar"/>
+        </w:rPr>
+        <w:t xml:space="preserve">    +---&gt; [PubMed API] --+--&gt; Deduplicate + Quality Filter (Scimago/OpenAlex Q1)</w:t>
+      </w:r>
+      <w:r>
+        <w:br/>
+      </w:r>
+      <w:r>
+        <w:rPr>
+          <w:rStyle w:val="VerbatimChar"/>
+        </w:rPr>
+        <w:t xml:space="preserve">    +---&gt; [Embase API] --+         |</w:t>
+      </w:r>
+      <w:r>
+        <w:br/>
+      </w:r>
+      <w:r>
+        <w:rPr>
+          <w:rStyle w:val="VerbatimChar"/>
+        </w:rPr>
+        <w:t xml:space="preserve">                               DOI Validation + Abstract Fetch (doi.org + PubMed)</w:t>
+      </w:r>
+      <w:r>
+        <w:br/>
+      </w:r>
+      <w:r>
+        <w:rPr>
+          <w:rStyle w:val="VerbatimChar"/>
+        </w:rPr>
+        <w:t xml:space="preserve">                                       |</w:t>
+      </w:r>
+      <w:r>
+        <w:br/>
+      </w:r>
+      <w:r>
+        <w:rPr>
+          <w:rStyle w:val="VerbatimChar"/>
+        </w:rPr>
+        <w:t xml:space="preserve">                               Haiku Extraction (5 subagents -&gt; JSON)</w:t>
+      </w:r>
+      <w:r>
+        <w:br/>
+      </w:r>
+      <w:r>
+        <w:rPr>
+          <w:rStyle w:val="VerbatimChar"/>
+        </w:rPr>
+        <w:t xml:space="preserve">                                       |</w:t>
+      </w:r>
+      <w:r>
+        <w:br/>
+      </w:r>
+      <w:r>
+        <w:rPr>
+          <w:rStyle w:val="VerbatimChar"/>
+        </w:rPr>
+        <w:t xml:space="preserve">                               Balanced Selection (16 subtopics, 50 articles)</w:t>
+      </w:r>
+      <w:r>
+        <w:br/>
+      </w:r>
+      <w:r>
+        <w:rPr>
+          <w:rStyle w:val="VerbatimChar"/>
+        </w:rPr>
+        <w:t xml:space="preserve">                                       |                      [HITL CP1-9]</w:t>
+      </w:r>
+      <w:r>
+        <w:br/>
+      </w:r>
+      <w:r>
+        <w:rPr>
+          <w:rStyle w:val="VerbatimChar"/>
+        </w:rPr>
+        <w:t xml:space="preserve">    +------------------------------------------------------------------+</w:t>
+      </w:r>
+      <w:r>
+        <w:br/>
+      </w:r>
+      <w:r>
+        <w:rPr>
+          <w:rStyle w:val="VerbatimChar"/>
+        </w:rPr>
+        <w:t xml:space="preserve">    | Modular Parallel Writing (8 Agents)                              |</w:t>
+      </w:r>
+      <w:r>
+        <w:br/>
+      </w:r>
+      <w:r>
+        <w:rPr>
+          <w:rStyle w:val="VerbatimChar"/>
+        </w:rPr>
+        <w:t xml:space="preserve">    | Abstract | Intro | Methods | Results | Treatment | Discussion    |</w:t>
+      </w:r>
+      <w:r>
+        <w:br/>
+      </w:r>
+      <w:r>
+        <w:rPr>
+          <w:rStyle w:val="VerbatimChar"/>
+        </w:rPr>
+        <w:t xml:space="preserve">    | Quarto {{&lt; include &gt;}} assembly                                  |</w:t>
+      </w:r>
+      <w:r>
+        <w:br/>
+      </w:r>
+      <w:r>
+        <w:rPr>
+          <w:rStyle w:val="VerbatimChar"/>
+        </w:rPr>
+        <w:t xml:space="preserve">    +------------------------------------------------------------------+</w:t>
+      </w:r>
+      <w:r>
+        <w:br/>
+      </w:r>
+      <w:r>
+        <w:rPr>
+          <w:rStyle w:val="VerbatimChar"/>
+        </w:rPr>
+        <w:t xml:space="preserve">                                       |</w:t>
+      </w:r>
+      <w:r>
+        <w:br/>
+      </w:r>
+      <w:r>
+        <w:rPr>
+          <w:rStyle w:val="VerbatimChar"/>
+        </w:rPr>
+        <w:t xml:space="preserve">                               PRISMA 2020 Self-Audit (27 items)</w:t>
+      </w:r>
+      <w:r>
+        <w:br/>
+      </w:r>
+      <w:r>
+        <w:rPr>
+          <w:rStyle w:val="VerbatimChar"/>
+        </w:rPr>
+        <w:t xml:space="preserve">                                    /        \</w:t>
+      </w:r>
+      <w:r>
+        <w:br/>
+      </w:r>
+      <w:r>
+        <w:rPr>
+          <w:rStyle w:val="VerbatimChar"/>
+        </w:rPr>
+        <w:t xml:space="preserve">                              [pass]         [fail/partial]</w:t>
+      </w:r>
+      <w:r>
+        <w:br/>
+      </w:r>
+      <w:r>
+        <w:rPr>
+          <w:rStyle w:val="VerbatimChar"/>
+        </w:rPr>
+        <w:t xml:space="preserve">                                |                 |</w:t>
+      </w:r>
+      <w:r>
+        <w:br/>
+      </w:r>
+      <w:r>
+        <w:rPr>
+          <w:rStyle w:val="VerbatimChar"/>
+        </w:rPr>
+        <w:t xml:space="preserve">                                |          Repair Agent --&gt; re-audit</w:t>
+      </w:r>
+      <w:r>
+        <w:br/>
+      </w:r>
+      <w:r>
+        <w:rPr>
+          <w:rStyle w:val="VerbatimChar"/>
+        </w:rPr>
+        <w:t xml:space="preserve">                                |</w:t>
+      </w:r>
+      <w:r>
+        <w:br/>
+      </w:r>
+      <w:r>
+        <w:rPr>
+          <w:rStyle w:val="VerbatimChar"/>
+        </w:rPr>
+        <w:t xml:space="preserve">                          Quarto Render (PDF + DOCX)</w:t>
+      </w:r>
+      <w:r>
+        <w:br/>
+      </w:r>
+      <w:r>
+        <w:rPr>
+          <w:rStyle w:val="VerbatimChar"/>
+        </w:rPr>
+        <w:t xml:space="preserve">                            /       |        \</w:t>
+      </w:r>
+      <w:r>
+        <w:br/>
+      </w:r>
+      <w:r>
+        <w:rPr>
+          <w:rStyle w:val="VerbatimChar"/>
+        </w:rPr>
+        <w:t xml:space="preserve">                     Cover Letter   BibTeX   GitHub Release</w:t>
+      </w:r>
+    </w:p>
+    <w:p>
+      <w:pPr>
+        <w:pStyle w:val="FirstParagraph"/>
       </w:pPr>
       <w:r>
         <w:t xml:space="preserve">The pipeline operates in two modes. In</w:t>

</xml_diff>